<commit_message>
Santa Fe: actualizar descripción del Código de consumidores y quitar nombres de firmantes
Co-Authored-By: Claude Opus 5.5 <noreply@anthropic.com>
Claude-Session: https://claude.ai/code/session_01LjZCUeZeukTqwmHG81QxgV
</commit_message>
<xml_diff>
--- a/presentaciones/santa_fe_sobreendeudamiento.docx
+++ b/presentaciones/santa_fe_sobreendeudamiento.docx
@@ -48,7 +48,7 @@
         <w:t xml:space="preserve">En síntesis: </w:t>
       </w:r>
       <w:r>
-        <w:t xml:space="preserve">Santa Fe ya tiene en marcha un plan para unificar deudas en un solo préstamo, y en la Legislatura hay al menos tres proyectos de ley. El más cercano a la defensa del consumidor es el Código de Gisel Mahmud, que crea un sistema para renegociar todas las deudas de una familia juntas. Ninguno de los proyectos figura como aprobado.</w:t>
+        <w:t xml:space="preserve">Santa Fe ya tiene en marcha un plan para unificar deudas en un solo préstamo, y en la Legislatura hay al menos tres proyectos de ley. El más cercano a la defensa del consumidor es un nuevo Código de derechos de consumidores, que exige préstamo responsable también a fintech y billeteras y crea un sistema para renegociar todas las deudas de una familia juntas. Ninguno de los proyectos figura como aprobado.</w:t>
       </w:r>
     </w:p>
     <w:p>
@@ -270,10 +270,7 @@
                 <w:b/>
                 <w:bCs/>
               </w:rPr>
-              <w:t xml:space="preserve">Código de Protección de Consumidores y Usuarios</w:t>
-            </w:r>
-            <w:r>
-              <w:t xml:space="preserve"> — Gisel Mahmud (PS)</w:t>
+              <w:t xml:space="preserve">Código de derechos de las personas consumidoras y usuarias</w:t>
             </w:r>
           </w:p>
         </w:tc>
@@ -295,7 +292,7 @@
           </w:tcPr>
           <w:p>
             <w:r>
-              <w:t xml:space="preserve">Un capítulo de sobreendeudamiento con un sistema extrajudicial de saneamiento: la familia renegocia todas sus deudas juntas, con asesoramiento del Estado. Suma educación financiera y reglas más estrictas para dar crédito.</w:t>
+              <w:t xml:space="preserve">Préstamo responsable para todo el que preste, incluidas fintech y billeteras; límites a la cobranza. Oficina de renegociación: audiencia única con todos los acreedores, plan de hasta 5 años y piso de un salario mínimo.</w:t>
             </w:r>
           </w:p>
         </w:tc>
@@ -350,9 +347,6 @@
               </w:rPr>
               <w:t xml:space="preserve">Refinanciación de deudas</w:t>
             </w:r>
-            <w:r>
-              <w:t xml:space="preserve"> — Lucila De Ponti</w:t>
-            </w:r>
           </w:p>
         </w:tc>
         <w:tc>
@@ -428,9 +422,6 @@
               </w:rPr>
               <w:t xml:space="preserve">Sistema provincial de asistencia</w:t>
             </w:r>
-            <w:r>
-              <w:t xml:space="preserve"> — Marcos Corach (PJ)</w:t>
-            </w:r>
           </w:p>
         </w:tc>
         <w:tc>
@@ -484,7 +475,7 @@
         <w:spacing w:after="120" w:before="160"/>
       </w:pPr>
       <w:r>
-        <w:t xml:space="preserve">La reforma constitucional santafesina de 2025 incorporó la protección frente a las prácticas abusivas y el sobreendeudamiento, y es el respaldo que invoca el proyecto de Mahmud. Un estudio del Centro DEMOS que ella cita estima que 6 de cada 10 santafesinos tienen alguna deuda tomada.</w:t>
+        <w:t xml:space="preserve">La reforma constitucional santafesina de 2025 incorporó la protección frente a las prácticas abusivas y el sobreendeudamiento, y es el respaldo que invoca el Código. Un estudio del Centro DEMOS citado en la presentación del proyecto estima que 6 de cada 10 santafesinos tienen alguna deuda tomada.</w:t>
       </w:r>
     </w:p>
     <w:p>
@@ -507,7 +498,7 @@
         <w:spacing w:after="120"/>
       </w:pPr>
       <w:r>
-        <w:t xml:space="preserve">Las comisiones de Finanzas y de Defensa del Consumidor de Diputados abrieron una ronda de reuniones sobre morosidad de los hogares, con cerca de 50 proyectos en espera de consenso. Mahmud llevó allí el caso santafesino.</w:t>
+        <w:t xml:space="preserve">Las comisiones de Finanzas y de Defensa del Consumidor de Diputados abrieron una ronda de reuniones sobre morosidad de los hogares, con cerca de 50 proyectos en espera de consenso. Legisladores santafesinos llevaron allí el caso de la provincia.</w:t>
       </w:r>
     </w:p>
     <w:p>
@@ -535,7 +526,7 @@
         <w:spacing w:after="80"/>
       </w:pPr>
       <w:r>
-        <w:t xml:space="preserve">La información sale de notas de prensa; no revisamos los textos de los proyectos ni el estado de cada expediente en la Legislatura.</w:t>
+        <w:t xml:space="preserve">Revisamos el texto del Código; los otros dos proyectos, solo por notas de prensa. No verificamos el estado de cada expediente.</w:t>
       </w:r>
     </w:p>
     <w:p>
@@ -570,7 +561,7 @@
       <w:pPr>
         <w:spacing w:after="40"/>
       </w:pPr>
-      <w:hyperlink w:history="1" r:id="rIdenykmgzh2wsanoxtposh3">
+      <w:hyperlink w:history="1" r:id="rIdvgah3hnr2m60xcvvxz8qx">
         <w:r>
           <w:rPr>
             <w:rStyle w:val="Hyperlink"/>
@@ -585,14 +576,14 @@
       <w:pPr>
         <w:spacing w:after="40"/>
       </w:pPr>
-      <w:hyperlink w:history="1" r:id="rIdjl2meavdunepcob0p6aei">
+      <w:hyperlink w:history="1" r:id="rIdptw8mvolbdvg0pohnr3ku">
         <w:r>
           <w:rPr>
             <w:rStyle w:val="Hyperlink"/>
             <w:sz w:val="18"/>
             <w:szCs w:val="18"/>
           </w:rPr>
-          <w:t xml:space="preserve">Pausa: Mahmud llevó al Congreso el sobreendeudamiento santafesino</w:t>
+          <w:t xml:space="preserve">Pausa: el sobreendeudamiento santafesino llegó al Congreso</w:t>
         </w:r>
       </w:hyperlink>
     </w:p>
@@ -600,7 +591,7 @@
       <w:pPr>
         <w:spacing w:after="40"/>
       </w:pPr>
-      <w:hyperlink w:history="1" r:id="rIdrdxwlsadpbrqkzphrci7a">
+      <w:hyperlink w:history="1" r:id="rIdby4fxrhzob4yox6z9nbqr">
         <w:r>
           <w:rPr>
             <w:rStyle w:val="Hyperlink"/>
@@ -615,7 +606,7 @@
       <w:pPr>
         <w:spacing w:after="40"/>
       </w:pPr>
-      <w:hyperlink w:history="1" r:id="rId7-vaf91xoesvccnhh_jdt">
+      <w:hyperlink w:history="1" r:id="rIdvx3gsl0ichde4qd91mkoi">
         <w:r>
           <w:rPr>
             <w:rStyle w:val="Hyperlink"/>
@@ -630,7 +621,7 @@
       <w:pPr>
         <w:spacing w:after="40"/>
       </w:pPr>
-      <w:hyperlink w:history="1" r:id="rId46pwmskjgunecxyrhbsbe">
+      <w:hyperlink w:history="1" r:id="rIdyucv5qtlzkwpybfxhranp">
         <w:r>
           <w:rPr>
             <w:rStyle w:val="Hyperlink"/>
@@ -645,7 +636,7 @@
       <w:pPr>
         <w:spacing w:after="40"/>
       </w:pPr>
-      <w:hyperlink w:history="1" r:id="rIdqv_nmeo6_e11yz7-173-d">
+      <w:hyperlink w:history="1" r:id="rIdc6cj2gpdngns-dgmbcy0x">
         <w:r>
           <w:rPr>
             <w:rStyle w:val="Hyperlink"/>
@@ -660,7 +651,7 @@
       <w:pPr>
         <w:spacing w:after="40"/>
       </w:pPr>
-      <w:hyperlink w:history="1" r:id="rIdpc-djjzm1onpphowpxc3o">
+      <w:hyperlink w:history="1" r:id="rIdwpblvlw0siwzww_9jl52g">
         <w:r>
           <w:rPr>
             <w:rStyle w:val="Hyperlink"/>
@@ -673,7 +664,7 @@
     </w:p>
     <w:sectPr>
       <w:pgSz w:w="11906" w:h="16838" w:orient="portrait"/>
-      <w:pgMar w:top="850" w:right="1440" w:bottom="850" w:left="1440" w:header="708" w:footer="708" w:gutter="0"/>
+      <w:pgMar w:top="720" w:right="1440" w:bottom="720" w:left="1440" w:header="708" w:footer="708" w:gutter="0"/>
       <w:pgNumType/>
       <w:docGrid w:linePitch="360"/>
     </w:sectPr>

</xml_diff>